<commit_message>
The documents quote the build Phase 9 leaves
Forty-four figures rewritten from a build of all 277 migrations from nothing
and seeded, not from the clone the work was done on — the clone is where the
2559-against-2558 of Phase 8 came from. 277 migrations, 553 doors, 112 suites,
2600 English strings and 561 German ones, and the Word document regenerated
from the same numbers.

That build is also the phase's proof: 188 of 188 catalogue checks pass, the
drain rehearsal carries a command, an email and a webhook out of the database
once each, 537 doors are named by the application with every door at home, and
screen strings read 1710 of 1710.

Co-Authored-By: Claude Opus 5 <noreply@anthropic.com>
Claude-Session: https://claude.ai/code/session_01WdUhq3t6CM8T29qjcncRya
</commit_message>
<xml_diff>
--- a/docs/Clove_ERP_What_Has_Been_Built.docx
+++ b/docs/Clove_ERP_What_Has_Been_Built.docx
@@ -36,7 +36,7 @@
     </w:p>
     <w:p>
       <w:r>
-        <w:t>Clove ERP is a tenant-neutral, multi-entity ERP platform whose behaviour is configured rather than coded. The product is a PostgreSQL schema of 269 migrations and 177495 lines of SQL, exposing 543 public functions — the doors — to an application, a device client, a dispatch worker and a platform console. Every rule the specification states in prose is a function that fails the build; every capability Part 5 names is a row in a register that says what delivers it; every decision the design took is bound to the check that enforces it; every door either has a screen or a row saying who calls it instead.</w:t>
+        <w:t>Clove ERP is a tenant-neutral, multi-entity ERP platform whose behaviour is configured rather than coded. The product is a PostgreSQL schema of 277 migrations and 183285 lines of SQL, exposing 553 public functions — the doors — to an application, a device client, a dispatch worker and a platform console. Every rule the specification states in prose is a function that fails the build; every capability Part 5 names is a row in a register that says what delivers it; every decision the design took is bound to the check that enforces it; every door either has a screen or a row saying who calls it instead.</w:t>
       </w:r>
     </w:p>
     <w:p>
@@ -133,7 +133,7 @@
           <w:p>
             <w:r/>
             <w:r>
-              <w:t>269</w:t>
+              <w:t>277</w:t>
             </w:r>
           </w:p>
         </w:tc>
@@ -175,7 +175,7 @@
           <w:p>
             <w:r/>
             <w:r>
-              <w:t>238</w:t>
+              <w:t>239</w:t>
             </w:r>
           </w:p>
         </w:tc>
@@ -220,7 +220,7 @@
           <w:p>
             <w:r/>
             <w:r>
-              <w:t>69</w:t>
+              <w:t>72</w:t>
             </w:r>
           </w:p>
         </w:tc>
@@ -265,7 +265,7 @@
           <w:p>
             <w:r/>
             <w:r>
-              <w:t>63</w:t>
+              <w:t>64</w:t>
             </w:r>
           </w:p>
         </w:tc>
@@ -310,7 +310,7 @@
           <w:p>
             <w:r/>
             <w:r>
-              <w:t>543</w:t>
+              <w:t>553</w:t>
             </w:r>
           </w:p>
         </w:tc>
@@ -331,7 +331,7 @@
               <w:t>public</w:t>
             </w:r>
             <w:r>
-              <w:t>; 392 may write, each with a registered gate</w:t>
+              <w:t>; 398 may write, each with a registered gate</w:t>
             </w:r>
           </w:p>
         </w:tc>
@@ -439,7 +439,7 @@
           <w:p>
             <w:r/>
             <w:r>
-              <w:t>104</w:t>
+              <w:t>112</w:t>
             </w:r>
           </w:p>
         </w:tc>
@@ -481,7 +481,7 @@
           <w:p>
             <w:r/>
             <w:r>
-              <w:t>180</w:t>
+              <w:t>188</w:t>
             </w:r>
           </w:p>
         </w:tc>
@@ -575,7 +575,7 @@
           <w:p>
             <w:r/>
             <w:r>
-              <w:t>345</w:t>
+              <w:t>349</w:t>
             </w:r>
           </w:p>
         </w:tc>
@@ -610,7 +610,7 @@
           <w:p>
             <w:r/>
             <w:r>
-              <w:t>770</w:t>
+              <w:t>774</w:t>
             </w:r>
           </w:p>
         </w:tc>
@@ -758,7 +758,7 @@
           <w:p>
             <w:r/>
             <w:r>
-              <w:t>D1–D41, bound by 78 checks</w:t>
+              <w:t>D1–D41, bound by 79 checks</w:t>
             </w:r>
           </w:p>
         </w:tc>
@@ -852,7 +852,7 @@
           <w:p>
             <w:r/>
             <w:r>
-              <w:t>2558</w:t>
+              <w:t>2600</w:t>
             </w:r>
           </w:p>
         </w:tc>
@@ -887,7 +887,7 @@
           <w:p>
             <w:r/>
             <w:r>
-              <w:t>558</w:t>
+              <w:t>561</w:t>
             </w:r>
           </w:p>
         </w:tc>
@@ -1182,7 +1182,7 @@
         <w:t>--single-transaction</w:t>
       </w:r>
       <w:r>
-        <w:t>, one organisation seeded with a year of trading. Then 180 catalogue checks, three rehearsals against a stub endpoint, the two-direction door check, the screen-string check, and this document rebuilt and compared.</w:t>
+        <w:t>, one organisation seeded with a year of trading. Then 188 catalogue checks, three rehearsals against a stub endpoint, the two-direction door check, the screen-string check, and this document rebuilt and compared.</w:t>
       </w:r>
     </w:p>
     <w:p>
@@ -1234,7 +1234,7 @@
         <w:pStyle w:val="ListBullet"/>
       </w:pPr>
       <w:r>
-        <w:t>German beyond the core pack of 558 strings is served from English and reported as such.</w:t>
+        <w:t>German beyond the core pack of 561 strings is served from English and reported as such.</w:t>
       </w:r>
     </w:p>
     <w:p>

</xml_diff>